<commit_message>
Plan: drop teaser video, Google Form, mic runner; on-site sticky-note Q&A; normalize ops plan formatting
Co-Authored-By: Claude Opus 5.5 <noreply@anthropic.com>
Claude-Session: https://claude.ai/code/session_01AuC6KZvNWwwTfKQ7Rhehh3
</commit_message>
<xml_diff>
--- a/hajun-papa/2026_창문축제_한동,배우다_기획서_수정본.docx
+++ b/hajun-papa/2026_창문축제_한동,배우다_기획서_수정본.docx
@@ -1810,7 +1810,7 @@
           <w:vertAlign w:val="baseline"/>
           <w:rtl w:val="0"/>
         </w:rPr>
-        <w:t xml:space="preserve"> 축제 타이틀 DREAMERS(꿈꾸는 사람들)에 맞추어, 크리스천 인플루언서 하준파파(황태환)를 초청하여 '꿈'을 주제로 강연과 질의응답을 진행하는 강연 프로그램이다. 본 프로그램은 학생들에게 일상에서 쉽게 접하기 어려운 문화 경험을 제공하고자 하는 제31대 총학생회 ‘FLOW’ 문화국 사업으로 준비되었으며, 더 많은 학생이 함께 누릴 수 있도록 전교생이 한자리에 모이는 가을축제 무대와 연계하여 진행한다. 축제 둘째 날 ‘나의 꿈’을 대표하는 프로그램으로서, 40분간의 강연에서는 화려한 성취만이 아니라 서툴렀던 시작과 흔들림, 다시 일어선 과정, 그리고 지금도 이어지는 꿈까지 강사의 삶의 여정을 따라가며, 꿈은 어느 한 시점에 완성되는 결과가 아니라 지금도 자라나고 있는 과정임을 전한다. 이어지는 20분간의 질의응답에서는 관객이 사전 및 현장 질문으로 직접 대화에 참여하며 각자의 꿈을 돌아보고 서로를 응원한다. 이처럼 가을창문축제 TFT와 총학생회 문화국이 함께 만드는 하나의 무대 위에서, 학생들이 꿈을 나누고 문화를 함께 누리는 자리를 만들고자 기획하였다. </w:t>
+        <w:t xml:space="preserve"> 축제 타이틀 DREAMERS(꿈꾸는 사람들)에 맞추어, 크리스천 인플루언서 하준파파(황태환)를 초청하여 '꿈'을 주제로 강연과 질의응답을 진행하는 강연 프로그램이다. 본 프로그램은 학생들에게 일상에서 쉽게 접하기 어려운 문화 경험을 제공하고자 하는 제31대 총학생회 ‘FLOW’ 문화국 사업으로 준비되었으며, 더 많은 학생이 함께 누릴 수 있도록 전교생이 한자리에 모이는 가을축제 무대와 연계하여 진행한다. 축제 둘째 날 ‘나의 꿈’을 대표하는 프로그램으로서, 40분간의 강연에서는 화려한 성취만이 아니라 서툴렀던 시작과 흔들림, 다시 일어선 과정, 그리고 지금도 이어지는 꿈까지 강사의 삶의 여정을 따라가며, 꿈은 어느 한 시점에 완성되는 결과가 아니라 지금도 자라나고 있는 과정임을 전한다. 이어지는 20분간의 질의응답에서는 관객이 현장 질문으로 직접 대화에 참여하며 각자의 꿈을 돌아보고 서로를 응원한다. 이처럼 가을창문축제 TFT와 총학생회 문화국이 함께 만드는 하나의 무대 위에서, 학생들이 꿈을 나누고 문화를 함께 누리는 자리를 만들고자 기획하였다. </w:t>
       </w:r>
       <w:r>
         <w:rPr>
@@ -2130,7 +2130,7 @@
           <w:vertAlign w:val="baseline"/>
           <w:rtl w:val="0"/>
         </w:rPr>
-        <w:t xml:space="preserve"> 하준파파의 꿈의 여정을 들으며 학생들은 자신의 꿈을 성찰하고 앞으로 나아갈 용기와 동기를 얻을 수 있다. 특히 진로와 신앙, 관계와 미래 앞에서 가장 많은 질문을 품고 있는 20대 청년들에게 20분간의 질의응답은, 강연에서 ‘들은 이야기’를 각자의 상황에 비추어 직접 묻고 답을 들으며 ‘나의 이야기’로 적용하는 시간이 된다. 사전 및 현장 질문을 통해 관객이 직접 참여함으로써 일방적인 강연이 아닌 쌍방향 소통을 이끌어 낼 수 있으며, 다른 학생들의 질문과 고민 속에서 나와 같은 고민을 발견하고 서로의 꿈을 공유하며 공감하는 시간을 가질 수 있다. 이를 통해 축제 타이틀인 DREAMERS(꿈꾸는 사람들)와 둘째 날 주제인 ‘나의 꿈’의 의미를 프로그램 안에서 직접 체감하고, 축제의 주제를 자연스럽게 기억하는 효과를 기대할 수 있다. 아울러 총학생회 문화국과 가을축제TFT가 무대와 음향, 운영 인력을 공유함으로써 한정된 예산과 인력을 효율적으로 운용하고, 축제를 찾은 많은 학생들에게 문화 경험을 폭넓게 전달할 수 있다. 이는 학생자치기구 간 협력의 좋은 사례가 되는 동시에, 학생들의 문화적 향유 기회를 넓힌다는 측면에서 도움이 될 것이다. </w:t>
+        <w:t xml:space="preserve"> 하준파파의 꿈의 여정을 들으며 학생들은 자신의 꿈을 성찰하고 앞으로 나아갈 용기와 동기를 얻을 수 있다. 특히 진로와 신앙, 관계와 미래 앞에서 가장 많은 질문을 품고 있는 20대 청년들에게 20분간의 질의응답은, 강연에서 ‘들은 이야기’를 각자의 상황에 비추어 직접 묻고 답을 들으며 ‘나의 이야기’로 적용하는 시간이 된다. 현장 질문을 통해 관객이 직접 참여함으로써 일방적인 강연이 아닌 쌍방향 소통을 이끌어 낼 수 있으며, 다른 학생들의 질문과 고민 속에서 나와 같은 고민을 발견하고 서로의 꿈을 공유하며 공감하는 시간을 가질 수 있다. 이를 통해 축제 타이틀인 DREAMERS(꿈꾸는 사람들)와 둘째 날 주제인 ‘나의 꿈’의 의미를 프로그램 안에서 직접 체감하고, 축제의 주제를 자연스럽게 기억하는 효과를 기대할 수 있다. 아울러 총학생회 문화국과 가을축제TFT가 무대와 음향, 운영 인력을 공유함으로써 한정된 예산과 인력을 효율적으로 운용하고, 축제를 찾은 많은 학생들에게 문화 경험을 폭넓게 전달할 수 있다. 이는 학생자치기구 간 협력의 좋은 사례가 되는 동시에, 학생들의 문화적 향유 기회를 넓힌다는 측면에서 도움이 될 것이다. </w:t>
       </w:r>
       <w:r>
         <w:rPr>
@@ -3055,7 +3055,7 @@
                 <w:vertAlign w:val="baseline"/>
                 <w:rtl w:val="0"/>
               </w:rPr>
-              <w:t xml:space="preserve">사회자가 프로그램을 소개하고, 티저 영상 재생 후 강사를 소개한다. (약 3’)</w:t>
+              <w:t xml:space="preserve">사회자가 프로그램을 소개하고, 강사를 무대로 초청하여 소개한다. (약 3’)</w:t>
             </w:r>
           </w:p>
           <w:p>
@@ -3226,7 +3226,64 @@
                 <w:vertAlign w:val="baseline"/>
                 <w:rtl w:val="0"/>
               </w:rPr>
-              <w:t xml:space="preserve">강연 주제와 구성은 강사의 뜻에 따라 최종 확정하며, 강연 중 사회자 보조 스태프가 시간을 체크한다.</w:t>
+              <w:t xml:space="preserve">강연 시작 전 객석에 포스트잇과 필기구를 배부하고, 강연을 들으며 궁금한 점을 적도록 안내한다.</w:t>
+            </w:r>
+          </w:p>
+          <w:p>
+            <w:pPr>
+              <w:keepNext w:val="0"/>
+              <w:keepLines w:val="0"/>
+              <w:pageBreakBefore w:val="0"/>
+              <w:widowControl w:val="1"/>
+              <w:numPr>
+                <w:ilvl w:val="0"/>
+                <w:numId w:val="8"/>
+              </w:numPr>
+              <w:pBdr>
+                <w:top w:space="0" w:sz="0" w:val="nil"/>
+                <w:left w:space="0" w:sz="0" w:val="nil"/>
+                <w:bottom w:space="0" w:sz="0" w:val="nil"/>
+                <w:right w:space="0" w:sz="0" w:val="nil"/>
+                <w:between w:space="0" w:sz="0" w:val="nil"/>
+              </w:pBdr>
+              <w:shd w:fill="auto" w:val="clear"/>
+              <w:spacing w:after="0" w:before="0" w:line="360" w:lineRule="auto"/>
+              <w:ind w:left="880" w:right="0" w:hanging="440"/>
+              <w:jc w:val="left"/>
+              <w:rPr>
+                <w:rFonts w:ascii="Pretendard" w:cs="Pretendard" w:eastAsia="Pretendard" w:hAnsi="Pretendard"/>
+                <w:b w:val="0"/>
+                <w:bCs w:val="0"/>
+                <w:i w:val="0"/>
+                <w:iCs w:val="0"/>
+                <w:smallCaps w:val="0"/>
+                <w:strike w:val="0"/>
+                <w:color w:val="000000"/>
+                <w:sz w:val="18"/>
+                <w:szCs w:val="18"/>
+                <w:u w:val="none"/>
+                <w:shd w:fill="auto" w:val="clear"/>
+                <w:vertAlign w:val="baseline"/>
+              </w:rPr>
+            </w:pPr>
+            <w:r>
+              <w:rPr>
+                <w:rFonts w:ascii="Pretendard" w:cs="Pretendard" w:eastAsia="Pretendard" w:hAnsi="Pretendard"/>
+                <w:b w:val="0"/>
+                <w:bCs w:val="0"/>
+                <w:i w:val="0"/>
+                <w:iCs w:val="0"/>
+                <w:smallCaps w:val="0"/>
+                <w:strike w:val="0"/>
+                <w:color w:val="000000"/>
+                <w:sz w:val="18"/>
+                <w:szCs w:val="18"/>
+                <w:u w:val="none"/>
+                <w:shd w:fill="auto" w:val="clear"/>
+                <w:vertAlign w:val="baseline"/>
+                <w:rtl w:val="0"/>
+              </w:rPr>
+              <w:t xml:space="preserve">강연 종료 5분 전부터 무대 인솔 스태프가 질문지를 수거하여 칠판에 부착하고 사회자에게 전달한다.</w:t>
             </w:r>
           </w:p>
           <w:p>
@@ -3322,7 +3379,7 @@
                 <w:vertAlign w:val="baseline"/>
                 <w:rtl w:val="0"/>
               </w:rPr>
-              <w:t xml:space="preserve">강연 종료 후 사회자가 무대에 올라 질의응답 방법(마이크맨, 질문 방식)을 안내한다.</w:t>
+              <w:t xml:space="preserve">강연 종료 후 사회자가 무대에 올라 질의응답을 시작한다.</w:t>
             </w:r>
           </w:p>
           <w:p>
@@ -3379,7 +3436,7 @@
                 <w:vertAlign w:val="baseline"/>
                 <w:rtl w:val="0"/>
               </w:rPr>
-              <w:t xml:space="preserve">사회자가 사전 질문(선정 큐카드)과 현장 질문(관객 지목)을 순서 구분 없이 자유롭게 섞어 진행한다.</w:t>
+              <w:t xml:space="preserve">사회자가 수거된 현장 질문지 중 질문을 선별하여 대독하고, 강사가 답변한다.</w:t>
             </w:r>
           </w:p>
           <w:p>
@@ -3436,7 +3493,7 @@
                 <w:vertAlign w:val="baseline"/>
                 <w:rtl w:val="0"/>
               </w:rPr>
-              <w:t xml:space="preserve">현장 질문 시 사회자가 객석에서 질문할 관객을 지목하면, 지정된 마이크맨이 해당 관객에게 마이크를 전달한다.</w:t>
+              <w:t xml:space="preserve">질문 1개당 약 3분, 총 5개 내외를 목표로 한다.</w:t>
             </w:r>
           </w:p>
           <w:p>
@@ -3493,64 +3550,7 @@
                 <w:vertAlign w:val="baseline"/>
                 <w:rtl w:val="0"/>
               </w:rPr>
-              <w:t xml:space="preserve">익명 신청자의 사전 질문은 이름 없이 소개한다.</w:t>
-            </w:r>
-          </w:p>
-          <w:p>
-            <w:pPr>
-              <w:keepNext w:val="0"/>
-              <w:keepLines w:val="0"/>
-              <w:pageBreakBefore w:val="0"/>
-              <w:widowControl w:val="1"/>
-              <w:numPr>
-                <w:ilvl w:val="0"/>
-                <w:numId w:val="10"/>
-              </w:numPr>
-              <w:pBdr>
-                <w:top w:space="0" w:sz="0" w:val="nil"/>
-                <w:left w:space="0" w:sz="0" w:val="nil"/>
-                <w:bottom w:space="0" w:sz="0" w:val="nil"/>
-                <w:right w:space="0" w:sz="0" w:val="nil"/>
-                <w:between w:space="0" w:sz="0" w:val="nil"/>
-              </w:pBdr>
-              <w:shd w:fill="auto" w:val="clear"/>
-              <w:spacing w:after="0" w:before="0" w:line="360" w:lineRule="auto"/>
-              <w:ind w:left="880" w:right="0" w:hanging="440"/>
-              <w:jc w:val="left"/>
-              <w:rPr>
-                <w:rFonts w:ascii="Pretendard" w:cs="Pretendard" w:eastAsia="Pretendard" w:hAnsi="Pretendard"/>
-                <w:b w:val="0"/>
-                <w:bCs w:val="0"/>
-                <w:i w:val="0"/>
-                <w:iCs w:val="0"/>
-                <w:smallCaps w:val="0"/>
-                <w:strike w:val="0"/>
-                <w:color w:val="000000"/>
-                <w:sz w:val="18"/>
-                <w:szCs w:val="18"/>
-                <w:u w:val="none"/>
-                <w:shd w:fill="auto" w:val="clear"/>
-                <w:vertAlign w:val="baseline"/>
-              </w:rPr>
-            </w:pPr>
-            <w:r>
-              <w:rPr>
-                <w:rFonts w:ascii="Pretendard" w:cs="Pretendard" w:eastAsia="Pretendard" w:hAnsi="Pretendard"/>
-                <w:b w:val="0"/>
-                <w:bCs w:val="0"/>
-                <w:i w:val="0"/>
-                <w:iCs w:val="0"/>
-                <w:smallCaps w:val="0"/>
-                <w:strike w:val="0"/>
-                <w:color w:val="000000"/>
-                <w:sz w:val="18"/>
-                <w:szCs w:val="18"/>
-                <w:u w:val="none"/>
-                <w:shd w:fill="auto" w:val="clear"/>
-                <w:vertAlign w:val="baseline"/>
-                <w:rtl w:val="0"/>
-              </w:rPr>
-              <w:t xml:space="preserve">질문 1개당 약 3분, 총 5개 내외를 목표로 하며, 현장 질문이 부족할 경우를 대비해 사전 질문 여분을 확보해 둔다.</w:t>
+              <w:t xml:space="preserve">현장 질문이 부족할 경우 사회자가 준비한 질문(붙임 1)으로 진행한다.</w:t>
             </w:r>
           </w:p>
           <w:p>
@@ -4117,7 +4117,7 @@
                 <w:szCs w:val="18"/>
                 <w:rtl w:val="0"/>
               </w:rPr>
-              <w:t xml:space="preserve">일정 재확인, 사례 및 의전(이동, 식사) 협의, 강연 주제·흐름 및 사전 질문 공유 여부 조율</w:t>
+              <w:t xml:space="preserve">일정 재확인, 사례 및 의전(이동, 식사) 협의, 강연 주제·흐름 및 질의응답 준비 질문 공유 여부 조율</w:t>
             </w:r>
           </w:p>
         </w:tc>
@@ -4208,7 +4208,7 @@
                 <w:szCs w:val="18"/>
                 <w:rtl w:val="0"/>
               </w:rPr>
-              <w:t xml:space="preserve">사전 영상 촬영 협조 요청</w:t>
+              <w:t xml:space="preserve">강사 소개 자료 요청</w:t>
             </w:r>
           </w:p>
         </w:tc>
@@ -4236,7 +4236,7 @@
                 <w:szCs w:val="18"/>
                 <w:rtl w:val="0"/>
               </w:rPr>
-              <w:t xml:space="preserve">강사 소개 영상, 당일 재생용 티저 영상 촬영을 강사 측에 요청</w:t>
+              <w:t xml:space="preserve">SNS 홍보용 강사 소개 사진·영상 활용 가능 여부를 강사 측에 확인</w:t>
             </w:r>
           </w:p>
         </w:tc>
@@ -4464,7 +4464,7 @@
                 <w:szCs w:val="18"/>
                 <w:rtl w:val="0"/>
               </w:rPr>
-              <w:t xml:space="preserve">사회자 보조, 무대 인솔, 마이크맨 등 후보 확인</w:t>
+              <w:t xml:space="preserve">사회자 보조, 무대 인솔 스태프 등 후보 확인</w:t>
             </w:r>
           </w:p>
         </w:tc>
@@ -4614,7 +4614,7 @@
                 <w:szCs w:val="18"/>
                 <w:rtl w:val="0"/>
               </w:rPr>
-              <w:t xml:space="preserve">SNS 및 포스터로 하준파파 공개, 강사 소개 영상 함께 공개</w:t>
+              <w:t xml:space="preserve">SNS 및 포스터로 하준파파 공개</w:t>
             </w:r>
           </w:p>
         </w:tc>
@@ -4672,7 +4672,7 @@
                 <w:szCs w:val="18"/>
                 <w:rtl w:val="0"/>
               </w:rPr>
-              <w:t xml:space="preserve">6주차</w:t>
+              <w:t xml:space="preserve">7주차(10/12~10/18)</w:t>
             </w:r>
           </w:p>
         </w:tc>
@@ -4700,7 +4700,7 @@
                 <w:szCs w:val="18"/>
                 <w:rtl w:val="0"/>
               </w:rPr>
-              <w:t xml:space="preserve">사전 질문 구글폼 오픈</w:t>
+              <w:t xml:space="preserve">인력 배치 확정</w:t>
             </w:r>
           </w:p>
         </w:tc>
@@ -4728,7 +4728,7 @@
                 <w:szCs w:val="18"/>
                 <w:rtl w:val="0"/>
               </w:rPr>
-              <w:t xml:space="preserve">안내, 기본정보(이름, 학번, 익명 여부), 질문 작성 항목 배포</w:t>
+              <w:t xml:space="preserve">사회자 보조, 무대 인솔 스태프 등 최종 확정</w:t>
             </w:r>
           </w:p>
         </w:tc>
@@ -4750,13 +4750,8 @@
             </w:pPr>
             <w:r>
               <w:rPr>
-                <w:rFonts w:ascii="Pretendard" w:cs="Pretendard" w:eastAsia="Pretendard" w:hAnsi="Pretendard"/>
-                <w:color w:val="000000"/>
-                <w:sz w:val="18"/>
-                <w:szCs w:val="18"/>
-                <w:rtl w:val="0"/>
-              </w:rPr>
-              <w:t xml:space="preserve">강사 공개와 함께 홍보</w:t>
+                <w:rtl w:val="0"/>
+              </w:rPr>
             </w:r>
           </w:p>
         </w:tc>
@@ -4791,16 +4786,9 @@
                 <w:szCs w:val="18"/>
                 <w:rtl w:val="0"/>
               </w:rPr>
-              <w:t xml:space="preserve">7주차</w:t>
-              <w:br w:type="textWrapping"/>
-              <w:t xml:space="preserve">(10/12~10/18)</w:t>
-            </w:r>
-          </w:p>
-        </w:tc>
-        <w:tc>
-          <w:tcPr>
-            <w:vAlign w:val="center"/>
-          </w:tcPr>
+              <w:t xml:space="preserve">8주차</w:t>
+            </w:r>
+          </w:p>
           <w:p>
             <w:pPr>
               <w:widowControl w:val="1"/>
@@ -4821,7 +4809,7 @@
                 <w:szCs w:val="18"/>
                 <w:rtl w:val="0"/>
               </w:rPr>
-              <w:t xml:space="preserve">사전 질문 수집 지속</w:t>
+              <w:t xml:space="preserve">(10/19~10/25)</w:t>
             </w:r>
           </w:p>
         </w:tc>
@@ -4849,7 +4837,7 @@
                 <w:szCs w:val="18"/>
                 <w:rtl w:val="0"/>
               </w:rPr>
-              <w:t xml:space="preserve">구글폼 접수 현황 확인</w:t>
+              <w:t xml:space="preserve">사회자 준비 질문 선정</w:t>
             </w:r>
           </w:p>
         </w:tc>
@@ -4877,7 +4865,35 @@
                 <w:szCs w:val="18"/>
                 <w:rtl w:val="0"/>
               </w:rPr>
-              <w:t xml:space="preserve">목표 최소 20개</w:t>
+              <w:t xml:space="preserve">붙임 1의 예상 질문 중 질의응답 보충용 질문 선별 및 순서 배치, 사회자 대본 반영</w:t>
+            </w:r>
+          </w:p>
+        </w:tc>
+        <w:tc>
+          <w:tcPr>
+            <w:vAlign w:val="center"/>
+          </w:tcPr>
+          <w:p>
+            <w:pPr>
+              <w:widowControl w:val="1"/>
+              <w:spacing w:line="360" w:lineRule="auto"/>
+              <w:jc w:val="center"/>
+              <w:rPr>
+                <w:rFonts w:ascii="Pretendard" w:cs="Pretendard" w:eastAsia="Pretendard" w:hAnsi="Pretendard"/>
+                <w:color w:val="000000"/>
+                <w:sz w:val="18"/>
+                <w:szCs w:val="18"/>
+              </w:rPr>
+            </w:pPr>
+            <w:r>
+              <w:rPr>
+                <w:rFonts w:ascii="Pretendard" w:cs="Pretendard" w:eastAsia="Pretendard" w:hAnsi="Pretendard"/>
+                <w:color w:val="000000"/>
+                <w:sz w:val="18"/>
+                <w:szCs w:val="18"/>
+                <w:rtl w:val="0"/>
+              </w:rPr>
+              <w:t xml:space="preserve">현장 질문 부족 대비</w:t>
             </w:r>
           </w:p>
         </w:tc>
@@ -4912,14 +4928,9 @@
                 <w:szCs w:val="18"/>
                 <w:rtl w:val="0"/>
               </w:rPr>
-              <w:t xml:space="preserve">7주차</w:t>
-            </w:r>
-          </w:p>
-        </w:tc>
-        <w:tc>
-          <w:tcPr>
-            <w:vAlign w:val="center"/>
-          </w:tcPr>
+              <w:t xml:space="preserve">8주차</w:t>
+            </w:r>
+          </w:p>
           <w:p>
             <w:pPr>
               <w:widowControl w:val="1"/>
@@ -4940,7 +4951,7 @@
                 <w:szCs w:val="18"/>
                 <w:rtl w:val="0"/>
               </w:rPr>
-              <w:t xml:space="preserve">당일 재생용 영상 제작</w:t>
+              <w:t xml:space="preserve"/>
             </w:r>
           </w:p>
         </w:tc>
@@ -4968,7 +4979,7 @@
                 <w:szCs w:val="18"/>
                 <w:rtl w:val="0"/>
               </w:rPr>
-              <w:t xml:space="preserve">VIP팀 내에서 1분 이내 티저 영상 편집</w:t>
+              <w:t xml:space="preserve">강연 제안서 전달 및 강연 내용 협의</w:t>
             </w:r>
           </w:p>
         </w:tc>
@@ -4990,8 +5001,41 @@
             </w:pPr>
             <w:r>
               <w:rPr>
-                <w:rtl w:val="0"/>
-              </w:rPr>
+                <w:rFonts w:ascii="Pretendard" w:cs="Pretendard" w:eastAsia="Pretendard" w:hAnsi="Pretendard"/>
+                <w:color w:val="000000"/>
+                <w:sz w:val="18"/>
+                <w:szCs w:val="18"/>
+                <w:rtl w:val="0"/>
+              </w:rPr>
+              <w:t xml:space="preserve">강연 주제(안)·흐름·질의응답 예상 질문을 담은 제안서 전달, 강연 구성 최종 협의</w:t>
+            </w:r>
+          </w:p>
+        </w:tc>
+        <w:tc>
+          <w:tcPr>
+            <w:vAlign w:val="center"/>
+          </w:tcPr>
+          <w:p>
+            <w:pPr>
+              <w:widowControl w:val="1"/>
+              <w:spacing w:line="360" w:lineRule="auto"/>
+              <w:jc w:val="center"/>
+              <w:rPr>
+                <w:rFonts w:ascii="Pretendard" w:cs="Pretendard" w:eastAsia="Pretendard" w:hAnsi="Pretendard"/>
+                <w:color w:val="000000"/>
+                <w:sz w:val="18"/>
+                <w:szCs w:val="18"/>
+              </w:rPr>
+            </w:pPr>
+            <w:r>
+              <w:rPr>
+                <w:rFonts w:ascii="Pretendard" w:cs="Pretendard" w:eastAsia="Pretendard" w:hAnsi="Pretendard"/>
+                <w:color w:val="000000"/>
+                <w:sz w:val="18"/>
+                <w:szCs w:val="18"/>
+                <w:rtl w:val="0"/>
+              </w:rPr>
+              <w:t xml:space="preserve">강연 자료(PPT) 사용 여부 확인</w:t>
             </w:r>
           </w:p>
         </w:tc>
@@ -5026,7 +5070,7 @@
                 <w:szCs w:val="18"/>
                 <w:rtl w:val="0"/>
               </w:rPr>
-              <w:t xml:space="preserve">7주차</w:t>
+              <w:t xml:space="preserve">9주차(10/26~11/1)</w:t>
             </w:r>
           </w:p>
         </w:tc>
@@ -5054,7 +5098,7 @@
                 <w:szCs w:val="18"/>
                 <w:rtl w:val="0"/>
               </w:rPr>
-              <w:t xml:space="preserve">인력 배치 확정</w:t>
+              <w:t xml:space="preserve">리허설</w:t>
             </w:r>
           </w:p>
         </w:tc>
@@ -5082,542 +5126,7 @@
                 <w:szCs w:val="18"/>
                 <w:rtl w:val="0"/>
               </w:rPr>
-              <w:t xml:space="preserve">사회자 보조, 무대 인솔, 마이크맨 등 최종 확정</w:t>
-            </w:r>
-          </w:p>
-        </w:tc>
-        <w:tc>
-          <w:tcPr>
-            <w:vAlign w:val="center"/>
-          </w:tcPr>
-          <w:p>
-            <w:pPr>
-              <w:widowControl w:val="1"/>
-              <w:spacing w:line="360" w:lineRule="auto"/>
-              <w:jc w:val="center"/>
-              <w:rPr>
-                <w:rFonts w:ascii="Pretendard" w:cs="Pretendard" w:eastAsia="Pretendard" w:hAnsi="Pretendard"/>
-                <w:color w:val="000000"/>
-                <w:sz w:val="18"/>
-                <w:szCs w:val="18"/>
-              </w:rPr>
-            </w:pPr>
-            <w:r>
-              <w:rPr>
-                <w:rtl w:val="0"/>
-              </w:rPr>
-            </w:r>
-          </w:p>
-        </w:tc>
-      </w:tr>
-      <w:tr>
-        <w:trPr>
-          <w:cantSplit w:val="0"/>
-          <w:trHeight w:val="459" w:hRule="atLeast"/>
-          <w:tblHeader w:val="0"/>
-        </w:trPr>
-        <w:tc>
-          <w:tcPr>
-            <w:vAlign w:val="center"/>
-          </w:tcPr>
-          <w:p>
-            <w:pPr>
-              <w:widowControl w:val="1"/>
-              <w:spacing w:line="360" w:lineRule="auto"/>
-              <w:jc w:val="center"/>
-              <w:rPr>
-                <w:rFonts w:ascii="Pretendard" w:cs="Pretendard" w:eastAsia="Pretendard" w:hAnsi="Pretendard"/>
-                <w:color w:val="000000"/>
-                <w:sz w:val="18"/>
-                <w:szCs w:val="18"/>
-              </w:rPr>
-            </w:pPr>
-            <w:r>
-              <w:rPr>
-                <w:rFonts w:ascii="Pretendard" w:cs="Pretendard" w:eastAsia="Pretendard" w:hAnsi="Pretendard"/>
-                <w:color w:val="000000"/>
-                <w:sz w:val="18"/>
-                <w:szCs w:val="18"/>
-                <w:rtl w:val="0"/>
-              </w:rPr>
-              <w:t xml:space="preserve">8주차</w:t>
-            </w:r>
-          </w:p>
-          <w:p>
-            <w:pPr>
-              <w:widowControl w:val="1"/>
-              <w:spacing w:line="360" w:lineRule="auto"/>
-              <w:jc w:val="center"/>
-              <w:rPr>
-                <w:rFonts w:ascii="Pretendard" w:cs="Pretendard" w:eastAsia="Pretendard" w:hAnsi="Pretendard"/>
-                <w:color w:val="000000"/>
-                <w:sz w:val="18"/>
-                <w:szCs w:val="18"/>
-              </w:rPr>
-            </w:pPr>
-            <w:r>
-              <w:rPr>
-                <w:rFonts w:ascii="Pretendard" w:cs="Pretendard" w:eastAsia="Pretendard" w:hAnsi="Pretendard"/>
-                <w:color w:val="000000"/>
-                <w:sz w:val="18"/>
-                <w:szCs w:val="18"/>
-                <w:rtl w:val="0"/>
-              </w:rPr>
-              <w:t xml:space="preserve">(10/19~10/25)</w:t>
-            </w:r>
-          </w:p>
-        </w:tc>
-        <w:tc>
-          <w:tcPr>
-            <w:vAlign w:val="center"/>
-          </w:tcPr>
-          <w:p>
-            <w:pPr>
-              <w:widowControl w:val="1"/>
-              <w:spacing w:line="360" w:lineRule="auto"/>
-              <w:jc w:val="center"/>
-              <w:rPr>
-                <w:rFonts w:ascii="Pretendard" w:cs="Pretendard" w:eastAsia="Pretendard" w:hAnsi="Pretendard"/>
-                <w:color w:val="000000"/>
-                <w:sz w:val="18"/>
-                <w:szCs w:val="18"/>
-              </w:rPr>
-            </w:pPr>
-            <w:r>
-              <w:rPr>
-                <w:rFonts w:ascii="Pretendard" w:cs="Pretendard" w:eastAsia="Pretendard" w:hAnsi="Pretendard"/>
-                <w:color w:val="000000"/>
-                <w:sz w:val="18"/>
-                <w:szCs w:val="18"/>
-                <w:rtl w:val="0"/>
-              </w:rPr>
-              <w:t xml:space="preserve">사전 질문 마감 및 선정</w:t>
-            </w:r>
-          </w:p>
-        </w:tc>
-        <w:tc>
-          <w:tcPr>
-            <w:vAlign w:val="center"/>
-          </w:tcPr>
-          <w:p>
-            <w:pPr>
-              <w:widowControl w:val="1"/>
-              <w:spacing w:line="360" w:lineRule="auto"/>
-              <w:jc w:val="center"/>
-              <w:rPr>
-                <w:rFonts w:ascii="Pretendard" w:cs="Pretendard" w:eastAsia="Pretendard" w:hAnsi="Pretendard"/>
-                <w:color w:val="000000"/>
-                <w:sz w:val="18"/>
-                <w:szCs w:val="18"/>
-              </w:rPr>
-            </w:pPr>
-            <w:r>
-              <w:rPr>
-                <w:rFonts w:ascii="Pretendard" w:cs="Pretendard" w:eastAsia="Pretendard" w:hAnsi="Pretendard"/>
-                <w:color w:val="000000"/>
-                <w:sz w:val="18"/>
-                <w:szCs w:val="18"/>
-                <w:rtl w:val="0"/>
-              </w:rPr>
-              <w:t xml:space="preserve">수집 마감, 질문 선별 및 순서 배치(5개 내외+여분), 사회자 대본 반영</w:t>
-            </w:r>
-          </w:p>
-        </w:tc>
-        <w:tc>
-          <w:tcPr>
-            <w:vAlign w:val="center"/>
-          </w:tcPr>
-          <w:p>
-            <w:pPr>
-              <w:widowControl w:val="1"/>
-              <w:spacing w:line="360" w:lineRule="auto"/>
-              <w:jc w:val="center"/>
-              <w:rPr>
-                <w:rFonts w:ascii="Pretendard" w:cs="Pretendard" w:eastAsia="Pretendard" w:hAnsi="Pretendard"/>
-                <w:color w:val="000000"/>
-                <w:sz w:val="18"/>
-                <w:szCs w:val="18"/>
-              </w:rPr>
-            </w:pPr>
-            <w:r>
-              <w:rPr>
-                <w:rFonts w:ascii="Pretendard" w:cs="Pretendard" w:eastAsia="Pretendard" w:hAnsi="Pretendard"/>
-                <w:color w:val="000000"/>
-                <w:sz w:val="18"/>
-                <w:szCs w:val="18"/>
-                <w:rtl w:val="0"/>
-              </w:rPr>
-              <w:t xml:space="preserve">목표에 못 미칠 시 홍보 재강화</w:t>
-            </w:r>
-          </w:p>
-        </w:tc>
-      </w:tr>
-      <w:tr>
-        <w:trPr>
-          <w:cantSplit w:val="0"/>
-          <w:trHeight w:val="459" w:hRule="atLeast"/>
-          <w:tblHeader w:val="0"/>
-        </w:trPr>
-        <w:tc>
-          <w:tcPr>
-            <w:vAlign w:val="center"/>
-          </w:tcPr>
-          <w:p>
-            <w:pPr>
-              <w:widowControl w:val="1"/>
-              <w:spacing w:line="360" w:lineRule="auto"/>
-              <w:jc w:val="center"/>
-              <w:rPr>
-                <w:rFonts w:ascii="Pretendard" w:cs="Pretendard" w:eastAsia="Pretendard" w:hAnsi="Pretendard"/>
-                <w:color w:val="000000"/>
-                <w:sz w:val="18"/>
-                <w:szCs w:val="18"/>
-              </w:rPr>
-            </w:pPr>
-            <w:r>
-              <w:rPr>
-                <w:rFonts w:ascii="Pretendard" w:cs="Pretendard" w:eastAsia="Pretendard" w:hAnsi="Pretendard"/>
-                <w:color w:val="000000"/>
-                <w:sz w:val="18"/>
-                <w:szCs w:val="18"/>
-                <w:rtl w:val="0"/>
-              </w:rPr>
-              <w:t xml:space="preserve">8주차</w:t>
-            </w:r>
-          </w:p>
-          <w:p>
-            <w:pPr>
-              <w:widowControl w:val="1"/>
-              <w:spacing w:line="360" w:lineRule="auto"/>
-              <w:jc w:val="center"/>
-              <w:rPr>
-                <w:rFonts w:ascii="Pretendard" w:cs="Pretendard" w:eastAsia="Pretendard" w:hAnsi="Pretendard"/>
-                <w:color w:val="000000"/>
-                <w:sz w:val="18"/>
-                <w:szCs w:val="18"/>
-              </w:rPr>
-            </w:pPr>
-            <w:r>
-              <w:rPr>
-                <w:rFonts w:ascii="Pretendard" w:cs="Pretendard" w:eastAsia="Pretendard" w:hAnsi="Pretendard"/>
-                <w:color w:val="000000"/>
-                <w:sz w:val="18"/>
-                <w:szCs w:val="18"/>
-                <w:rtl w:val="0"/>
-              </w:rPr>
-              <w:t xml:space="preserve"/>
-            </w:r>
-          </w:p>
-        </w:tc>
-        <w:tc>
-          <w:tcPr>
-            <w:vAlign w:val="center"/>
-          </w:tcPr>
-          <w:p>
-            <w:pPr>
-              <w:widowControl w:val="1"/>
-              <w:spacing w:line="360" w:lineRule="auto"/>
-              <w:jc w:val="center"/>
-              <w:rPr>
-                <w:rFonts w:ascii="Pretendard" w:cs="Pretendard" w:eastAsia="Pretendard" w:hAnsi="Pretendard"/>
-                <w:color w:val="000000"/>
-                <w:sz w:val="18"/>
-                <w:szCs w:val="18"/>
-              </w:rPr>
-            </w:pPr>
-            <w:r>
-              <w:rPr>
-                <w:rFonts w:ascii="Pretendard" w:cs="Pretendard" w:eastAsia="Pretendard" w:hAnsi="Pretendard"/>
-                <w:color w:val="000000"/>
-                <w:sz w:val="18"/>
-                <w:szCs w:val="18"/>
-                <w:rtl w:val="0"/>
-              </w:rPr>
-              <w:t xml:space="preserve">강연 제안서 전달 및 강연 내용 협의</w:t>
-            </w:r>
-          </w:p>
-        </w:tc>
-        <w:tc>
-          <w:tcPr>
-            <w:vAlign w:val="center"/>
-          </w:tcPr>
-          <w:p>
-            <w:pPr>
-              <w:widowControl w:val="1"/>
-              <w:spacing w:line="360" w:lineRule="auto"/>
-              <w:jc w:val="center"/>
-              <w:rPr>
-                <w:rFonts w:ascii="Pretendard" w:cs="Pretendard" w:eastAsia="Pretendard" w:hAnsi="Pretendard"/>
-                <w:color w:val="000000"/>
-                <w:sz w:val="18"/>
-                <w:szCs w:val="18"/>
-              </w:rPr>
-            </w:pPr>
-            <w:r>
-              <w:rPr>
-                <w:rFonts w:ascii="Pretendard" w:cs="Pretendard" w:eastAsia="Pretendard" w:hAnsi="Pretendard"/>
-                <w:color w:val="000000"/>
-                <w:sz w:val="18"/>
-                <w:szCs w:val="18"/>
-                <w:rtl w:val="0"/>
-              </w:rPr>
-              <w:t xml:space="preserve">강연 주제(안)·흐름·질의응답 예상 질문을 담은 제안서 전달, 강연 구성 최종 협의</w:t>
-            </w:r>
-          </w:p>
-        </w:tc>
-        <w:tc>
-          <w:tcPr>
-            <w:vAlign w:val="center"/>
-          </w:tcPr>
-          <w:p>
-            <w:pPr>
-              <w:widowControl w:val="1"/>
-              <w:spacing w:line="360" w:lineRule="auto"/>
-              <w:jc w:val="center"/>
-              <w:rPr>
-                <w:rFonts w:ascii="Pretendard" w:cs="Pretendard" w:eastAsia="Pretendard" w:hAnsi="Pretendard"/>
-                <w:color w:val="000000"/>
-                <w:sz w:val="18"/>
-                <w:szCs w:val="18"/>
-              </w:rPr>
-            </w:pPr>
-            <w:r>
-              <w:rPr>
-                <w:rFonts w:ascii="Pretendard" w:cs="Pretendard" w:eastAsia="Pretendard" w:hAnsi="Pretendard"/>
-                <w:color w:val="000000"/>
-                <w:sz w:val="18"/>
-                <w:szCs w:val="18"/>
-                <w:rtl w:val="0"/>
-              </w:rPr>
-              <w:t xml:space="preserve">강연 자료(PPT) 사용 여부 확인</w:t>
-            </w:r>
-          </w:p>
-        </w:tc>
-      </w:tr>
-      <w:tr>
-        <w:trPr>
-          <w:cantSplit w:val="0"/>
-          <w:trHeight w:val="459" w:hRule="atLeast"/>
-          <w:tblHeader w:val="0"/>
-        </w:trPr>
-        <w:tc>
-          <w:tcPr>
-            <w:vAlign w:val="center"/>
-          </w:tcPr>
-          <w:p>
-            <w:pPr>
-              <w:widowControl w:val="1"/>
-              <w:spacing w:line="360" w:lineRule="auto"/>
-              <w:jc w:val="center"/>
-              <w:rPr>
-                <w:rFonts w:ascii="Pretendard" w:cs="Pretendard" w:eastAsia="Pretendard" w:hAnsi="Pretendard"/>
-                <w:color w:val="000000"/>
-                <w:sz w:val="18"/>
-                <w:szCs w:val="18"/>
-              </w:rPr>
-            </w:pPr>
-            <w:r>
-              <w:rPr>
-                <w:rFonts w:ascii="Pretendard" w:cs="Pretendard" w:eastAsia="Pretendard" w:hAnsi="Pretendard"/>
-                <w:color w:val="000000"/>
-                <w:sz w:val="18"/>
-                <w:szCs w:val="18"/>
-                <w:rtl w:val="0"/>
-              </w:rPr>
-              <w:t xml:space="preserve">9주차</w:t>
-            </w:r>
-          </w:p>
-          <w:p>
-            <w:pPr>
-              <w:widowControl w:val="1"/>
-              <w:spacing w:line="360" w:lineRule="auto"/>
-              <w:jc w:val="center"/>
-              <w:rPr>
-                <w:rFonts w:ascii="Pretendard" w:cs="Pretendard" w:eastAsia="Pretendard" w:hAnsi="Pretendard"/>
-                <w:color w:val="000000"/>
-                <w:sz w:val="18"/>
-                <w:szCs w:val="18"/>
-              </w:rPr>
-            </w:pPr>
-            <w:r>
-              <w:rPr>
-                <w:rFonts w:ascii="Pretendard" w:cs="Pretendard" w:eastAsia="Pretendard" w:hAnsi="Pretendard"/>
-                <w:color w:val="000000"/>
-                <w:sz w:val="18"/>
-                <w:szCs w:val="18"/>
-                <w:rtl w:val="0"/>
-              </w:rPr>
-              <w:t xml:space="preserve">(10/26~11/1)</w:t>
-            </w:r>
-          </w:p>
-        </w:tc>
-        <w:tc>
-          <w:tcPr>
-            <w:vAlign w:val="center"/>
-          </w:tcPr>
-          <w:p>
-            <w:pPr>
-              <w:widowControl w:val="1"/>
-              <w:spacing w:line="360" w:lineRule="auto"/>
-              <w:jc w:val="center"/>
-              <w:rPr>
-                <w:rFonts w:ascii="Pretendard" w:cs="Pretendard" w:eastAsia="Pretendard" w:hAnsi="Pretendard"/>
-                <w:color w:val="000000"/>
-                <w:sz w:val="18"/>
-                <w:szCs w:val="18"/>
-              </w:rPr>
-            </w:pPr>
-            <w:r>
-              <w:rPr>
-                <w:rFonts w:ascii="Pretendard" w:cs="Pretendard" w:eastAsia="Pretendard" w:hAnsi="Pretendard"/>
-                <w:color w:val="000000"/>
-                <w:sz w:val="18"/>
-                <w:szCs w:val="18"/>
-                <w:rtl w:val="0"/>
-              </w:rPr>
-              <w:t xml:space="preserve">당일 재생용 영상 확정</w:t>
-            </w:r>
-          </w:p>
-        </w:tc>
-        <w:tc>
-          <w:tcPr>
-            <w:vAlign w:val="center"/>
-          </w:tcPr>
-          <w:p>
-            <w:pPr>
-              <w:widowControl w:val="1"/>
-              <w:spacing w:line="360" w:lineRule="auto"/>
-              <w:jc w:val="center"/>
-              <w:rPr>
-                <w:rFonts w:ascii="Pretendard" w:cs="Pretendard" w:eastAsia="Pretendard" w:hAnsi="Pretendard"/>
-                <w:color w:val="000000"/>
-                <w:sz w:val="18"/>
-                <w:szCs w:val="18"/>
-              </w:rPr>
-            </w:pPr>
-            <w:r>
-              <w:rPr>
-                <w:rFonts w:ascii="Pretendard" w:cs="Pretendard" w:eastAsia="Pretendard" w:hAnsi="Pretendard"/>
-                <w:color w:val="000000"/>
-                <w:sz w:val="18"/>
-                <w:szCs w:val="18"/>
-                <w:rtl w:val="0"/>
-              </w:rPr>
-              <w:t xml:space="preserve">검수 후 확정</w:t>
-            </w:r>
-          </w:p>
-        </w:tc>
-        <w:tc>
-          <w:tcPr>
-            <w:vAlign w:val="center"/>
-          </w:tcPr>
-          <w:p>
-            <w:pPr>
-              <w:widowControl w:val="1"/>
-              <w:spacing w:line="360" w:lineRule="auto"/>
-              <w:jc w:val="center"/>
-              <w:rPr>
-                <w:rFonts w:ascii="Pretendard" w:cs="Pretendard" w:eastAsia="Pretendard" w:hAnsi="Pretendard"/>
-                <w:color w:val="000000"/>
-                <w:sz w:val="18"/>
-                <w:szCs w:val="18"/>
-              </w:rPr>
-            </w:pPr>
-            <w:r>
-              <w:rPr>
-                <w:rtl w:val="0"/>
-              </w:rPr>
-            </w:r>
-          </w:p>
-        </w:tc>
-      </w:tr>
-      <w:tr>
-        <w:trPr>
-          <w:cantSplit w:val="0"/>
-          <w:trHeight w:val="459" w:hRule="atLeast"/>
-          <w:tblHeader w:val="0"/>
-        </w:trPr>
-        <w:tc>
-          <w:tcPr>
-            <w:vAlign w:val="center"/>
-          </w:tcPr>
-          <w:p>
-            <w:pPr>
-              <w:widowControl w:val="1"/>
-              <w:spacing w:line="360" w:lineRule="auto"/>
-              <w:jc w:val="center"/>
-              <w:rPr>
-                <w:rFonts w:ascii="Pretendard" w:cs="Pretendard" w:eastAsia="Pretendard" w:hAnsi="Pretendard"/>
-                <w:color w:val="000000"/>
-                <w:sz w:val="18"/>
-                <w:szCs w:val="18"/>
-              </w:rPr>
-            </w:pPr>
-            <w:r>
-              <w:rPr>
-                <w:rFonts w:ascii="Pretendard" w:cs="Pretendard" w:eastAsia="Pretendard" w:hAnsi="Pretendard"/>
-                <w:color w:val="000000"/>
-                <w:sz w:val="18"/>
-                <w:szCs w:val="18"/>
-                <w:rtl w:val="0"/>
-              </w:rPr>
-              <w:t xml:space="preserve">9주차</w:t>
-            </w:r>
-          </w:p>
-        </w:tc>
-        <w:tc>
-          <w:tcPr>
-            <w:vAlign w:val="center"/>
-          </w:tcPr>
-          <w:p>
-            <w:pPr>
-              <w:widowControl w:val="1"/>
-              <w:spacing w:line="360" w:lineRule="auto"/>
-              <w:jc w:val="center"/>
-              <w:rPr>
-                <w:rFonts w:ascii="Pretendard" w:cs="Pretendard" w:eastAsia="Pretendard" w:hAnsi="Pretendard"/>
-                <w:color w:val="000000"/>
-                <w:sz w:val="18"/>
-                <w:szCs w:val="18"/>
-              </w:rPr>
-            </w:pPr>
-            <w:r>
-              <w:rPr>
-                <w:rFonts w:ascii="Pretendard" w:cs="Pretendard" w:eastAsia="Pretendard" w:hAnsi="Pretendard"/>
-                <w:color w:val="000000"/>
-                <w:sz w:val="18"/>
-                <w:szCs w:val="18"/>
-                <w:rtl w:val="0"/>
-              </w:rPr>
-              <w:t xml:space="preserve">리허설</w:t>
-            </w:r>
-          </w:p>
-        </w:tc>
-        <w:tc>
-          <w:tcPr>
-            <w:vAlign w:val="center"/>
-          </w:tcPr>
-          <w:p>
-            <w:pPr>
-              <w:widowControl w:val="1"/>
-              <w:spacing w:line="360" w:lineRule="auto"/>
-              <w:jc w:val="center"/>
-              <w:rPr>
-                <w:rFonts w:ascii="Pretendard" w:cs="Pretendard" w:eastAsia="Pretendard" w:hAnsi="Pretendard"/>
-                <w:color w:val="000000"/>
-                <w:sz w:val="18"/>
-                <w:szCs w:val="18"/>
-              </w:rPr>
-            </w:pPr>
-            <w:r>
-              <w:rPr>
-                <w:rFonts w:ascii="Pretendard" w:cs="Pretendard" w:eastAsia="Pretendard" w:hAnsi="Pretendard"/>
-                <w:color w:val="000000"/>
-                <w:sz w:val="18"/>
-                <w:szCs w:val="18"/>
-                <w:rtl w:val="0"/>
-              </w:rPr>
-              <w:t xml:space="preserve">사회자, 마이크맨, 큐시트, 영상 및 강연 자료(PPT) 송출 확인</w:t>
+              <w:t xml:space="preserve">사회자, 큐시트, 강연 자료(PPT) 송출, 질문지 배부·수거 동선 확인</w:t>
             </w:r>
           </w:p>
         </w:tc>
@@ -6288,7 +5797,7 @@
                 <w:szCs w:val="18"/>
                 <w:rtl w:val="0"/>
               </w:rPr>
-              <w:t xml:space="preserve">오프닝: 프로그램 소개, 티저 영상 재생, 강사 입장 및 소개</w:t>
+              <w:t xml:space="preserve">오프닝: 프로그램 소개, 강사 입장 및 소개</w:t>
             </w:r>
           </w:p>
         </w:tc>
@@ -6316,7 +5825,7 @@
                 <w:szCs w:val="18"/>
                 <w:rtl w:val="0"/>
               </w:rPr>
-              <w:t xml:space="preserve">사회자, 강사, 티저 영상</w:t>
+              <w:t xml:space="preserve">사회자, 강사</w:t>
             </w:r>
           </w:p>
         </w:tc>
@@ -6410,7 +5919,7 @@
                 <w:szCs w:val="18"/>
                 <w:rtl w:val="0"/>
               </w:rPr>
-              <w:t xml:space="preserve">하준파파 강연: 진짜 Dreamer로 사는 법</w:t>
+              <w:t xml:space="preserve">하준파파 강연: 진짜 Dreamer로 사는 법(강연 중 현장 질문지 작성 및 수거)</w:t>
             </w:r>
           </w:p>
           <w:p>
@@ -6461,7 +5970,7 @@
                 <w:szCs w:val="18"/>
                 <w:rtl w:val="0"/>
               </w:rPr>
-              <w:t xml:space="preserve">강사, 무선 마이크, 강연 자료(PPT) 송출</w:t>
+              <w:t xml:space="preserve">강사, 무선 마이크, 강연 자료(PPT) 송출, 포스트잇·필기구, 무대 인솔 스태프</w:t>
             </w:r>
           </w:p>
         </w:tc>
@@ -6552,7 +6061,7 @@
                 <w:szCs w:val="18"/>
                 <w:rtl w:val="0"/>
               </w:rPr>
-              <w:t xml:space="preserve">질의응답(사전 및 현장 질문 혼합, 5개 내외)</w:t>
+              <w:t xml:space="preserve">질의응답(현장 질문지 선별 대독, 5개 내외)</w:t>
             </w:r>
           </w:p>
           <w:p>
@@ -6603,7 +6112,7 @@
                 <w:szCs w:val="18"/>
                 <w:rtl w:val="0"/>
               </w:rPr>
-              <w:t xml:space="preserve">사회자, 강사, 마이크맨, 마이크, 사전 질문 큐카드</w:t>
+              <w:t xml:space="preserve">사회자, 강사, 칠판, 사회자 준비 질문 큐카드</w:t>
             </w:r>
           </w:p>
         </w:tc>
@@ -7058,62 +6567,6 @@
         <w:keepLines w:val="0"/>
         <w:pageBreakBefore w:val="0"/>
         <w:widowControl w:val="0"/>
-        <w:numPr>
-          <w:ilvl w:val="2"/>
-          <w:numId w:val="5"/>
-        </w:numPr>
-        <w:pBdr>
-          <w:top w:space="0" w:sz="0" w:val="nil"/>
-          <w:left w:space="0" w:sz="0" w:val="nil"/>
-          <w:bottom w:space="0" w:sz="0" w:val="nil"/>
-          <w:right w:space="0" w:sz="0" w:val="nil"/>
-          <w:between w:space="0" w:sz="0" w:val="nil"/>
-        </w:pBdr>
-        <w:shd w:fill="auto" w:val="clear"/>
-        <w:spacing w:after="0" w:before="0" w:line="240" w:lineRule="auto"/>
-        <w:ind w:left="2560" w:right="0" w:hanging="360"/>
-        <w:jc w:val="left"/>
-        <w:rPr>
-          <w:b w:val="0"/>
-          <w:bCs w:val="0"/>
-          <w:i w:val="0"/>
-          <w:iCs w:val="0"/>
-          <w:smallCaps w:val="0"/>
-          <w:strike w:val="0"/>
-          <w:color w:val="000000"/>
-          <w:sz w:val="22"/>
-          <w:szCs w:val="22"/>
-          <w:u w:val="none"/>
-          <w:shd w:fill="auto" w:val="clear"/>
-          <w:vertAlign w:val="baseline"/>
-        </w:rPr>
-      </w:pPr>
-      <w:r>
-        <w:rPr>
-          <w:rFonts w:ascii="Pretendard" w:cs="Pretendard" w:eastAsia="Pretendard" w:hAnsi="Pretendard"/>
-          <w:b w:val="0"/>
-          <w:bCs w:val="0"/>
-          <w:i w:val="0"/>
-          <w:iCs w:val="0"/>
-          <w:smallCaps w:val="0"/>
-          <w:strike w:val="0"/>
-          <w:color w:val="000000"/>
-          <w:sz w:val="22"/>
-          <w:szCs w:val="22"/>
-          <w:u w:val="none"/>
-          <w:shd w:fill="auto" w:val="clear"/>
-          <w:vertAlign w:val="baseline"/>
-          <w:rtl w:val="0"/>
-        </w:rPr>
-        <w:t xml:space="preserve">사전 질문 구글폼 QR이 삽입된 배너</w:t>
-      </w:r>
-    </w:p>
-    <w:p>
-      <w:pPr>
-        <w:keepNext w:val="0"/>
-        <w:keepLines w:val="0"/>
-        <w:pageBreakBefore w:val="0"/>
-        <w:widowControl w:val="0"/>
         <w:pBdr>
           <w:top w:space="0" w:sz="0" w:val="nil"/>
           <w:left w:space="0" w:sz="0" w:val="nil"/>
@@ -7214,7 +6667,7 @@
           <w:vertAlign w:val="baseline"/>
           <w:rtl w:val="0"/>
         </w:rPr>
-        <w:t xml:space="preserve">오프닝 티저 영상, 강연 자료(PPT) 및 당일 재생 영상 송출</w:t>
+        <w:t xml:space="preserve">강연 자료(PPT) 송출</w:t>
       </w:r>
     </w:p>
     <w:p>
@@ -7326,7 +6779,7 @@
           <w:vertAlign w:val="baseline"/>
           <w:rtl w:val="0"/>
         </w:rPr>
-        <w:t xml:space="preserve">무선 마이크 3개 이상 준비 (사회자, 강사, 마이크맨용)</w:t>
+        <w:t xml:space="preserve">무선 마이크 2개 이상 준비 (사회자, 강사용) 및 예비 마이크 1개</w:t>
       </w:r>
     </w:p>
     <w:p>
@@ -7447,7 +6900,7 @@
           <w:vertAlign w:val="baseline"/>
           <w:rtl w:val="0"/>
         </w:rPr>
-        <w:t xml:space="preserve">- 마이크맨은 사회자의 지목과 동시에 즉시 이동할 수 있도록 대기 위치를 사전에 협의. </w:t>
+        <w:t xml:space="preserve">- 질의응답은 현장 질문지(포스트잇)로 진행하며, 강연 시작 전 객석에 포스트잇과 필기구를 배부하고 질문 작성 방법을 안내.</w:t>
       </w:r>
     </w:p>
     <w:p>
@@ -7500,7 +6953,60 @@
           <w:vertAlign w:val="baseline"/>
           <w:rtl w:val="0"/>
         </w:rPr>
-        <w:t xml:space="preserve">- 강사 촬영 협조(소개 영상, 당일 재생 영상) 일정은 강사 스케줄에 따라 변동될 수 있으므로 여유 있게 요청. </w:t>
+        <w:t xml:space="preserve">- 질문지는 강연 종료 5분 전부터 무대 인솔 스태프가 수거하여 칠판에 부착하고, 질의응답 시작 전 사회자에게 전달.</w:t>
+      </w:r>
+    </w:p>
+    <w:p>
+      <w:pPr>
+        <w:keepNext w:val="0"/>
+        <w:keepLines w:val="0"/>
+        <w:pageBreakBefore w:val="0"/>
+        <w:widowControl w:val="1"/>
+        <w:pBdr>
+          <w:top w:space="0" w:sz="0" w:val="nil"/>
+          <w:left w:space="0" w:sz="0" w:val="nil"/>
+          <w:bottom w:space="0" w:sz="0" w:val="nil"/>
+          <w:right w:space="0" w:sz="0" w:val="nil"/>
+          <w:between w:space="0" w:sz="0" w:val="nil"/>
+        </w:pBdr>
+        <w:shd w:fill="auto" w:val="clear"/>
+        <w:spacing w:after="0" w:before="0" w:line="360" w:lineRule="auto"/>
+        <w:ind w:left="1760" w:right="0" w:firstLine="0"/>
+        <w:jc w:val="left"/>
+        <w:rPr>
+          <w:rFonts w:ascii="Pretendard" w:cs="Pretendard" w:eastAsia="Pretendard" w:hAnsi="Pretendard"/>
+          <w:b w:val="0"/>
+          <w:bCs w:val="0"/>
+          <w:i w:val="0"/>
+          <w:iCs w:val="0"/>
+          <w:smallCaps w:val="0"/>
+          <w:strike w:val="0"/>
+          <w:color w:val="000000"/>
+          <w:sz w:val="22"/>
+          <w:szCs w:val="22"/>
+          <w:u w:val="none"/>
+          <w:shd w:fill="auto" w:val="clear"/>
+          <w:vertAlign w:val="baseline"/>
+        </w:rPr>
+      </w:pPr>
+      <w:r>
+        <w:rPr>
+          <w:rFonts w:ascii="Pretendard" w:cs="Pretendard" w:eastAsia="Pretendard" w:hAnsi="Pretendard"/>
+          <w:b w:val="0"/>
+          <w:bCs w:val="0"/>
+          <w:i w:val="0"/>
+          <w:iCs w:val="0"/>
+          <w:smallCaps w:val="0"/>
+          <w:strike w:val="0"/>
+          <w:color w:val="000000"/>
+          <w:sz w:val="22"/>
+          <w:szCs w:val="22"/>
+          <w:u w:val="none"/>
+          <w:shd w:fill="auto" w:val="clear"/>
+          <w:vertAlign w:val="baseline"/>
+          <w:rtl w:val="0"/>
+        </w:rPr>
+        <w:t xml:space="preserve">- 강연 자료(PPT) 사용 여부와 파일은 행사 1주 전까지 강사 측에 확인하여 수합.</w:t>
       </w:r>
     </w:p>
     <w:p>
@@ -7554,59 +7060,6 @@
           <w:rtl w:val="0"/>
         </w:rPr>
         <w:t xml:space="preserve">- 딜레이 발생 시 질의응답의 질문 개수를 탄력적으로 축소 조정.</w:t>
-      </w:r>
-    </w:p>
-    <w:p>
-      <w:pPr>
-        <w:keepNext w:val="0"/>
-        <w:keepLines w:val="0"/>
-        <w:pageBreakBefore w:val="0"/>
-        <w:widowControl w:val="1"/>
-        <w:pBdr>
-          <w:top w:space="0" w:sz="0" w:val="nil"/>
-          <w:left w:space="0" w:sz="0" w:val="nil"/>
-          <w:bottom w:space="0" w:sz="0" w:val="nil"/>
-          <w:right w:space="0" w:sz="0" w:val="nil"/>
-          <w:between w:space="0" w:sz="0" w:val="nil"/>
-        </w:pBdr>
-        <w:shd w:fill="auto" w:val="clear"/>
-        <w:spacing w:after="160" w:before="0" w:line="360" w:lineRule="auto"/>
-        <w:ind w:left="1760" w:right="0" w:firstLine="0"/>
-        <w:jc w:val="left"/>
-        <w:rPr>
-          <w:rFonts w:ascii="Pretendard" w:cs="Pretendard" w:eastAsia="Pretendard" w:hAnsi="Pretendard"/>
-          <w:b w:val="0"/>
-          <w:bCs w:val="0"/>
-          <w:i w:val="0"/>
-          <w:iCs w:val="0"/>
-          <w:smallCaps w:val="0"/>
-          <w:strike w:val="0"/>
-          <w:color w:val="000000"/>
-          <w:sz w:val="22"/>
-          <w:szCs w:val="22"/>
-          <w:u w:val="none"/>
-          <w:shd w:fill="auto" w:val="clear"/>
-          <w:vertAlign w:val="baseline"/>
-        </w:rPr>
-      </w:pPr>
-      <w:r>
-        <w:rPr>
-          <w:rFonts w:ascii="Pretendard" w:cs="Pretendard" w:eastAsia="Pretendard" w:hAnsi="Pretendard"/>
-          <w:b w:val="0"/>
-          <w:bCs w:val="0"/>
-          <w:i w:val="0"/>
-          <w:iCs w:val="0"/>
-          <w:smallCaps w:val="0"/>
-          <w:strike w:val="0"/>
-          <w:color w:val="000000"/>
-          <w:sz w:val="22"/>
-          <w:szCs w:val="22"/>
-          <w:u w:val="none"/>
-          <w:shd w:fill="auto" w:val="clear"/>
-          <w:vertAlign w:val="baseline"/>
-          <w:rtl w:val="0"/>
-        </w:rPr>
-        <w:t xml:space="preserve">- 강연 자료(PPT) 사용 여부와 파일은 행사 1주 전까지 강사 측에 확인하여 수합.</w:t>
       </w:r>
     </w:p>
     <w:p>
@@ -7741,95 +7194,161 @@
     </w:p>
     <w:p>
       <w:pPr>
-        <w:ind w:left="1320" w:firstLine="0"/>
-        <w:rPr/>
-      </w:pPr>
-      <w:sdt>
-        <w:sdtPr>
-          <w:id w:val="395625234"/>
-          <w:tag w:val="goog_rdk_1"/>
-        </w:sdtPr>
-        <w:sdtContent>
-          <w:r>
-            <w:rPr>
-              <w:rFonts w:ascii="Gungsuh" w:cs="Gungsuh" w:eastAsia="Gungsuh" w:hAnsi="Gungsuh"/>
-              <w:rtl w:val="0"/>
-            </w:rPr>
-            <w:t xml:space="preserve">- 사회자 / 1인 / 프로그램 및 강사 소개, 질의응답 진행 리드, 시간 관리</w:t>
-          </w:r>
-        </w:sdtContent>
-      </w:sdt>
+        <w:keepNext w:val="0"/>
+        <w:keepLines w:val="0"/>
+        <w:pageBreakBefore w:val="0"/>
+        <w:widowControl w:val="1"/>
+        <w:pBdr>
+          <w:top w:space="0" w:sz="0" w:val="nil"/>
+          <w:left w:space="0" w:sz="0" w:val="nil"/>
+          <w:bottom w:space="0" w:sz="0" w:val="nil"/>
+          <w:right w:space="0" w:sz="0" w:val="nil"/>
+          <w:between w:space="0" w:sz="0" w:val="nil"/>
+        </w:pBdr>
+        <w:shd w:fill="auto" w:val="clear"/>
+        <w:spacing w:after="0" w:before="0" w:line="360" w:lineRule="auto"/>
+        <w:ind w:left="1760" w:right="0" w:firstLine="0"/>
+        <w:jc w:val="left"/>
+        <w:rPr>
+          <w:rFonts w:ascii="Pretendard" w:cs="Pretendard" w:eastAsia="Pretendard" w:hAnsi="Pretendard"/>
+          <w:b w:val="0"/>
+          <w:bCs w:val="0"/>
+          <w:i w:val="0"/>
+          <w:iCs w:val="0"/>
+          <w:smallCaps w:val="0"/>
+          <w:strike w:val="0"/>
+          <w:color w:val="000000"/>
+          <w:sz w:val="22"/>
+          <w:szCs w:val="22"/>
+          <w:u w:val="none"/>
+          <w:shd w:fill="auto" w:val="clear"/>
+          <w:vertAlign w:val="baseline"/>
+        </w:rPr>
+      </w:pPr>
+      <w:r>
+        <w:rPr>
+          <w:rFonts w:ascii="Pretendard" w:cs="Pretendard" w:eastAsia="Pretendard" w:hAnsi="Pretendard"/>
+          <w:b w:val="0"/>
+          <w:bCs w:val="0"/>
+          <w:i w:val="0"/>
+          <w:iCs w:val="0"/>
+          <w:smallCaps w:val="0"/>
+          <w:strike w:val="0"/>
+          <w:color w:val="000000"/>
+          <w:sz w:val="22"/>
+          <w:szCs w:val="22"/>
+          <w:u w:val="none"/>
+          <w:shd w:fill="auto" w:val="clear"/>
+          <w:vertAlign w:val="baseline"/>
+          <w:rtl w:val="0"/>
+        </w:rPr>
+        <w:t xml:space="preserve">- 사회자 / 1인 / 프로그램 및 강사 소개, 현장 질문지 선별·대독, 질의응답 진행 리드, 시간 관리</w:t>
+      </w:r>
     </w:p>
     <w:p>
       <w:pPr>
-        <w:ind w:left="1320" w:firstLine="0"/>
-        <w:rPr/>
-      </w:pPr>
-      <w:sdt>
-        <w:sdtPr>
-          <w:id w:val="-503439537"/>
-          <w:tag w:val="goog_rdk_2"/>
-        </w:sdtPr>
-        <w:sdtContent>
-          <w:r>
-            <w:rPr>
-              <w:rFonts w:ascii="Gungsuh" w:cs="Gungsuh" w:eastAsia="Gungsuh" w:hAnsi="Gungsuh"/>
-              <w:rtl w:val="0"/>
-            </w:rPr>
-            <w:t xml:space="preserve">- 사회자 보조 스태프 / 1인 / 현장과 사회자 간 소통 관리, 시간 체크 및 진행 상황 전달, 딜레이 발생 시 현장 판단으로 유연하게 대처</w:t>
-          </w:r>
-        </w:sdtContent>
-      </w:sdt>
+        <w:keepNext w:val="0"/>
+        <w:keepLines w:val="0"/>
+        <w:pageBreakBefore w:val="0"/>
+        <w:widowControl w:val="1"/>
+        <w:pBdr>
+          <w:top w:space="0" w:sz="0" w:val="nil"/>
+          <w:left w:space="0" w:sz="0" w:val="nil"/>
+          <w:bottom w:space="0" w:sz="0" w:val="nil"/>
+          <w:right w:space="0" w:sz="0" w:val="nil"/>
+          <w:between w:space="0" w:sz="0" w:val="nil"/>
+        </w:pBdr>
+        <w:shd w:fill="auto" w:val="clear"/>
+        <w:spacing w:after="0" w:before="0" w:line="360" w:lineRule="auto"/>
+        <w:ind w:left="1760" w:right="0" w:firstLine="0"/>
+        <w:jc w:val="left"/>
+        <w:rPr>
+          <w:rFonts w:ascii="Pretendard" w:cs="Pretendard" w:eastAsia="Pretendard" w:hAnsi="Pretendard"/>
+          <w:b w:val="0"/>
+          <w:bCs w:val="0"/>
+          <w:i w:val="0"/>
+          <w:iCs w:val="0"/>
+          <w:smallCaps w:val="0"/>
+          <w:strike w:val="0"/>
+          <w:color w:val="000000"/>
+          <w:sz w:val="22"/>
+          <w:szCs w:val="22"/>
+          <w:u w:val="none"/>
+          <w:shd w:fill="auto" w:val="clear"/>
+          <w:vertAlign w:val="baseline"/>
+        </w:rPr>
+      </w:pPr>
+      <w:r>
+        <w:rPr>
+          <w:rFonts w:ascii="Pretendard" w:cs="Pretendard" w:eastAsia="Pretendard" w:hAnsi="Pretendard"/>
+          <w:b w:val="0"/>
+          <w:bCs w:val="0"/>
+          <w:i w:val="0"/>
+          <w:iCs w:val="0"/>
+          <w:smallCaps w:val="0"/>
+          <w:strike w:val="0"/>
+          <w:color w:val="000000"/>
+          <w:sz w:val="22"/>
+          <w:szCs w:val="22"/>
+          <w:u w:val="none"/>
+          <w:shd w:fill="auto" w:val="clear"/>
+          <w:vertAlign w:val="baseline"/>
+          <w:rtl w:val="0"/>
+        </w:rPr>
+        <w:t xml:space="preserve">- 사회자 보조 스태프 / 1인 / 현장과 사회자 간 소통 관리, 시간 체크 및 진행 상황 전달, 딜레이 발생 시 현장 판단으로 유연하게 대처</w:t>
+      </w:r>
     </w:p>
     <w:p>
       <w:pPr>
-        <w:ind w:left="1320" w:firstLine="0"/>
-        <w:rPr/>
-      </w:pPr>
-      <w:sdt>
-        <w:sdtPr>
-          <w:id w:val="-1186357650"/>
-          <w:tag w:val="goog_rdk_3"/>
-        </w:sdtPr>
-        <w:sdtContent>
-          <w:r>
-            <w:rPr>
-              <w:rFonts w:ascii="Gungsuh" w:cs="Gungsuh" w:eastAsia="Gungsuh" w:hAnsi="Gungsuh"/>
-              <w:rtl w:val="0"/>
-            </w:rPr>
-            <w:t xml:space="preserve">- 마이크맨 / 1인 / 사회자 지목에 따라 해당 관객에게 마이크 전달 및 회수, 사전 교육(이동 동선, 마이크 사용법) 이수</w:t>
-          </w:r>
-        </w:sdtContent>
-      </w:sdt>
-    </w:p>
-    <w:p>
-      <w:pPr>
+        <w:keepNext w:val="0"/>
+        <w:keepLines w:val="0"/>
+        <w:pageBreakBefore w:val="0"/>
         <w:widowControl w:val="1"/>
-        <w:spacing w:line="360" w:lineRule="auto"/>
-        <w:ind w:left="1320" w:firstLine="0"/>
-        <w:rPr>
-          <w:rFonts w:ascii="Pretendard" w:cs="Pretendard" w:eastAsia="Pretendard" w:hAnsi="Pretendard"/>
-        </w:rPr>
-      </w:pPr>
-      <w:sdt>
-        <w:sdtPr>
-          <w:id w:val="-2080641571"/>
-          <w:tag w:val="goog_rdk_4"/>
-        </w:sdtPr>
-        <w:sdtContent>
-          <w:r>
-            <w:rPr>
-              <w:rFonts w:ascii="Gungsuh" w:cs="Gungsuh" w:eastAsia="Gungsuh" w:hAnsi="Gungsuh"/>
-              <w:rtl w:val="0"/>
-            </w:rPr>
-            <w:t xml:space="preserve">- 무대 인솔 스태프 / 3인 / 강사 무대 동선 안내, 현장 질문자 이동 보조, 프로그램 종료 후 무대 정리 및 물품 회수</w:t>
-          </w:r>
-        </w:sdtContent>
-      </w:sdt>
+        <w:pBdr>
+          <w:top w:space="0" w:sz="0" w:val="nil"/>
+          <w:left w:space="0" w:sz="0" w:val="nil"/>
+          <w:bottom w:space="0" w:sz="0" w:val="nil"/>
+          <w:right w:space="0" w:sz="0" w:val="nil"/>
+          <w:between w:space="0" w:sz="0" w:val="nil"/>
+        </w:pBdr>
+        <w:shd w:fill="auto" w:val="clear"/>
+        <w:spacing w:after="160" w:before="0" w:line="360" w:lineRule="auto"/>
+        <w:ind w:left="1760" w:right="0" w:firstLine="0"/>
+        <w:jc w:val="left"/>
+        <w:rPr>
+          <w:rFonts w:ascii="Pretendard" w:cs="Pretendard" w:eastAsia="Pretendard" w:hAnsi="Pretendard"/>
+          <w:b w:val="0"/>
+          <w:bCs w:val="0"/>
+          <w:i w:val="0"/>
+          <w:iCs w:val="0"/>
+          <w:smallCaps w:val="0"/>
+          <w:strike w:val="0"/>
+          <w:color w:val="000000"/>
+          <w:sz w:val="22"/>
+          <w:szCs w:val="22"/>
+          <w:u w:val="none"/>
+          <w:shd w:fill="auto" w:val="clear"/>
+          <w:vertAlign w:val="baseline"/>
+        </w:rPr>
+      </w:pPr>
       <w:r>
         <w:rPr>
+          <w:rFonts w:ascii="Pretendard" w:cs="Pretendard" w:eastAsia="Pretendard" w:hAnsi="Pretendard"/>
+          <w:b w:val="0"/>
+          <w:bCs w:val="0"/>
+          <w:i w:val="0"/>
+          <w:iCs w:val="0"/>
+          <w:smallCaps w:val="0"/>
+          <w:strike w:val="0"/>
+          <w:color w:val="000000"/>
+          <w:sz w:val="22"/>
+          <w:szCs w:val="22"/>
+          <w:u w:val="none"/>
+          <w:shd w:fill="auto" w:val="clear"/>
+          <w:vertAlign w:val="baseline"/>
           <w:rtl w:val="0"/>
         </w:rPr>
+        <w:t xml:space="preserve">- 무대 인솔 스태프 / 3인 / 강사 무대 동선 안내, 포스트잇·필기구 배부 및 질문지 수거·칠판 부착, 프로그램 종료 후 무대 정리 및 물품 회수</w:t>
       </w:r>
     </w:p>
     <w:p>
@@ -7891,135 +7410,373 @@
     </w:p>
     <w:p>
       <w:pPr>
-        <w:ind w:left="1320" w:firstLine="0"/>
-        <w:rPr/>
-      </w:pPr>
-      <w:sdt>
-        <w:sdtPr>
-          <w:id w:val="-438731414"/>
-          <w:tag w:val="goog_rdk_5"/>
-        </w:sdtPr>
-        <w:sdtContent>
-          <w:r>
-            <w:rPr>
-              <w:rFonts w:ascii="Gungsuh" w:cs="Gungsuh" w:eastAsia="Gungsuh" w:hAnsi="Gungsuh"/>
-              <w:rtl w:val="0"/>
-            </w:rPr>
-            <w:t xml:space="preserve">- 우천: 우천 예보 시 D-1일 실내 대체 장소(예: 채플) 이동 여부 사전 협의, 캐노피 천막 준비</w:t>
-          </w:r>
-        </w:sdtContent>
-      </w:sdt>
+        <w:keepNext w:val="0"/>
+        <w:keepLines w:val="0"/>
+        <w:pageBreakBefore w:val="0"/>
+        <w:widowControl w:val="1"/>
+        <w:pBdr>
+          <w:top w:space="0" w:sz="0" w:val="nil"/>
+          <w:left w:space="0" w:sz="0" w:val="nil"/>
+          <w:bottom w:space="0" w:sz="0" w:val="nil"/>
+          <w:right w:space="0" w:sz="0" w:val="nil"/>
+          <w:between w:space="0" w:sz="0" w:val="nil"/>
+        </w:pBdr>
+        <w:shd w:fill="auto" w:val="clear"/>
+        <w:spacing w:after="0" w:before="0" w:line="360" w:lineRule="auto"/>
+        <w:ind w:left="1760" w:right="0" w:firstLine="0"/>
+        <w:jc w:val="left"/>
+        <w:rPr>
+          <w:rFonts w:ascii="Pretendard" w:cs="Pretendard" w:eastAsia="Pretendard" w:hAnsi="Pretendard"/>
+          <w:b w:val="0"/>
+          <w:bCs w:val="0"/>
+          <w:i w:val="0"/>
+          <w:iCs w:val="0"/>
+          <w:smallCaps w:val="0"/>
+          <w:strike w:val="0"/>
+          <w:color w:val="000000"/>
+          <w:sz w:val="22"/>
+          <w:szCs w:val="22"/>
+          <w:u w:val="none"/>
+          <w:shd w:fill="auto" w:val="clear"/>
+          <w:vertAlign w:val="baseline"/>
+        </w:rPr>
+      </w:pPr>
+      <w:r>
+        <w:rPr>
+          <w:rFonts w:ascii="Pretendard" w:cs="Pretendard" w:eastAsia="Pretendard" w:hAnsi="Pretendard"/>
+          <w:b w:val="0"/>
+          <w:bCs w:val="0"/>
+          <w:i w:val="0"/>
+          <w:iCs w:val="0"/>
+          <w:smallCaps w:val="0"/>
+          <w:strike w:val="0"/>
+          <w:color w:val="000000"/>
+          <w:sz w:val="22"/>
+          <w:szCs w:val="22"/>
+          <w:u w:val="none"/>
+          <w:shd w:fill="auto" w:val="clear"/>
+          <w:vertAlign w:val="baseline"/>
+          <w:rtl w:val="0"/>
+        </w:rPr>
+        <w:t xml:space="preserve">- 우천: 우천 예보 시 D-1일 실내 대체 장소(예: 채플) 이동 여부 사전 협의, 캐노피 천막 준비</w:t>
+      </w:r>
     </w:p>
     <w:p>
       <w:pPr>
-        <w:ind w:left="1320" w:firstLine="0"/>
-        <w:rPr/>
-      </w:pPr>
-      <w:sdt>
-        <w:sdtPr>
-          <w:id w:val="-1755137264"/>
-          <w:tag w:val="goog_rdk_6"/>
-        </w:sdtPr>
-        <w:sdtContent>
-          <w:r>
-            <w:rPr>
-              <w:rFonts w:ascii="Gungsuh" w:cs="Gungsuh" w:eastAsia="Gungsuh" w:hAnsi="Gungsuh"/>
-              <w:rtl w:val="0"/>
-            </w:rPr>
-            <w:t xml:space="preserve">- 강사 지각·불참: 비상 연락망 확보, 지연 시 오프닝 티저 영상을 늘려 시간 확보, 불참 시 사회자 단독 진행 시나리오 사전 준비</w:t>
-          </w:r>
-        </w:sdtContent>
-      </w:sdt>
+        <w:keepNext w:val="0"/>
+        <w:keepLines w:val="0"/>
+        <w:pageBreakBefore w:val="0"/>
+        <w:widowControl w:val="1"/>
+        <w:pBdr>
+          <w:top w:space="0" w:sz="0" w:val="nil"/>
+          <w:left w:space="0" w:sz="0" w:val="nil"/>
+          <w:bottom w:space="0" w:sz="0" w:val="nil"/>
+          <w:right w:space="0" w:sz="0" w:val="nil"/>
+          <w:between w:space="0" w:sz="0" w:val="nil"/>
+        </w:pBdr>
+        <w:shd w:fill="auto" w:val="clear"/>
+        <w:spacing w:after="0" w:before="0" w:line="360" w:lineRule="auto"/>
+        <w:ind w:left="1760" w:right="0" w:firstLine="0"/>
+        <w:jc w:val="left"/>
+        <w:rPr>
+          <w:rFonts w:ascii="Pretendard" w:cs="Pretendard" w:eastAsia="Pretendard" w:hAnsi="Pretendard"/>
+          <w:b w:val="0"/>
+          <w:bCs w:val="0"/>
+          <w:i w:val="0"/>
+          <w:iCs w:val="0"/>
+          <w:smallCaps w:val="0"/>
+          <w:strike w:val="0"/>
+          <w:color w:val="000000"/>
+          <w:sz w:val="22"/>
+          <w:szCs w:val="22"/>
+          <w:u w:val="none"/>
+          <w:shd w:fill="auto" w:val="clear"/>
+          <w:vertAlign w:val="baseline"/>
+        </w:rPr>
+      </w:pPr>
+      <w:r>
+        <w:rPr>
+          <w:rFonts w:ascii="Pretendard" w:cs="Pretendard" w:eastAsia="Pretendard" w:hAnsi="Pretendard"/>
+          <w:b w:val="0"/>
+          <w:bCs w:val="0"/>
+          <w:i w:val="0"/>
+          <w:iCs w:val="0"/>
+          <w:smallCaps w:val="0"/>
+          <w:strike w:val="0"/>
+          <w:color w:val="000000"/>
+          <w:sz w:val="22"/>
+          <w:szCs w:val="22"/>
+          <w:u w:val="none"/>
+          <w:shd w:fill="auto" w:val="clear"/>
+          <w:vertAlign w:val="baseline"/>
+          <w:rtl w:val="0"/>
+        </w:rPr>
+        <w:t xml:space="preserve">- 강사 지각·불참: 비상 연락망 확보, 지연 시 사회자 오프닝 멘트 및 BGM으로 시간 확보, 불참 시 사회자 단독 진행 시나리오 사전 준비</w:t>
+      </w:r>
     </w:p>
     <w:p>
       <w:pPr>
-        <w:ind w:left="1320" w:firstLine="0"/>
-        <w:rPr/>
-      </w:pPr>
-      <w:sdt>
-        <w:sdtPr>
-          <w:id w:val="808970630"/>
-          <w:tag w:val="goog_rdk_7"/>
-        </w:sdtPr>
-        <w:sdtContent>
-          <w:r>
-            <w:rPr>
-              <w:rFonts w:ascii="Gungsuh" w:cs="Gungsuh" w:eastAsia="Gungsuh" w:hAnsi="Gungsuh"/>
-              <w:rtl w:val="0"/>
-            </w:rPr>
-            <w:t xml:space="preserve">- 시간 초과: 강연이 길어질 경우 질의응답 질문 개수를 축소, 20:57 마무리 멘트 시작 원칙을 사회자와 사전 합의</w:t>
-          </w:r>
-        </w:sdtContent>
-      </w:sdt>
+        <w:keepNext w:val="0"/>
+        <w:keepLines w:val="0"/>
+        <w:pageBreakBefore w:val="0"/>
+        <w:widowControl w:val="1"/>
+        <w:pBdr>
+          <w:top w:space="0" w:sz="0" w:val="nil"/>
+          <w:left w:space="0" w:sz="0" w:val="nil"/>
+          <w:bottom w:space="0" w:sz="0" w:val="nil"/>
+          <w:right w:space="0" w:sz="0" w:val="nil"/>
+          <w:between w:space="0" w:sz="0" w:val="nil"/>
+        </w:pBdr>
+        <w:shd w:fill="auto" w:val="clear"/>
+        <w:spacing w:after="0" w:before="0" w:line="360" w:lineRule="auto"/>
+        <w:ind w:left="1760" w:right="0" w:firstLine="0"/>
+        <w:jc w:val="left"/>
+        <w:rPr>
+          <w:rFonts w:ascii="Pretendard" w:cs="Pretendard" w:eastAsia="Pretendard" w:hAnsi="Pretendard"/>
+          <w:b w:val="0"/>
+          <w:bCs w:val="0"/>
+          <w:i w:val="0"/>
+          <w:iCs w:val="0"/>
+          <w:smallCaps w:val="0"/>
+          <w:strike w:val="0"/>
+          <w:color w:val="000000"/>
+          <w:sz w:val="22"/>
+          <w:szCs w:val="22"/>
+          <w:u w:val="none"/>
+          <w:shd w:fill="auto" w:val="clear"/>
+          <w:vertAlign w:val="baseline"/>
+        </w:rPr>
+      </w:pPr>
+      <w:r>
+        <w:rPr>
+          <w:rFonts w:ascii="Pretendard" w:cs="Pretendard" w:eastAsia="Pretendard" w:hAnsi="Pretendard"/>
+          <w:b w:val="0"/>
+          <w:bCs w:val="0"/>
+          <w:i w:val="0"/>
+          <w:iCs w:val="0"/>
+          <w:smallCaps w:val="0"/>
+          <w:strike w:val="0"/>
+          <w:color w:val="000000"/>
+          <w:sz w:val="22"/>
+          <w:szCs w:val="22"/>
+          <w:u w:val="none"/>
+          <w:shd w:fill="auto" w:val="clear"/>
+          <w:vertAlign w:val="baseline"/>
+          <w:rtl w:val="0"/>
+        </w:rPr>
+        <w:t xml:space="preserve">- 시간 초과: 강연이 길어질 경우 질의응답 질문 개수를 축소, 20:57 마무리 멘트 시작 원칙을 사회자와 사전 합의</w:t>
+      </w:r>
     </w:p>
     <w:p>
       <w:pPr>
-        <w:ind w:left="1320" w:firstLine="0"/>
-        <w:rPr/>
-      </w:pPr>
-      <w:sdt>
-        <w:sdtPr>
-          <w:id w:val="1264133907"/>
-          <w:tag w:val="goog_rdk_8"/>
-        </w:sdtPr>
-        <w:sdtContent>
-          <w:r>
-            <w:rPr>
-              <w:rFonts w:ascii="Gungsuh" w:cs="Gungsuh" w:eastAsia="Gungsuh" w:hAnsi="Gungsuh"/>
-              <w:rtl w:val="0"/>
-            </w:rPr>
-            <w:t xml:space="preserve">- 현장 질문 부족: 사전 질문 여분을 확보해 두어 즉시 대체</w:t>
-          </w:r>
-        </w:sdtContent>
-      </w:sdt>
+        <w:keepNext w:val="0"/>
+        <w:keepLines w:val="0"/>
+        <w:pageBreakBefore w:val="0"/>
+        <w:widowControl w:val="1"/>
+        <w:pBdr>
+          <w:top w:space="0" w:sz="0" w:val="nil"/>
+          <w:left w:space="0" w:sz="0" w:val="nil"/>
+          <w:bottom w:space="0" w:sz="0" w:val="nil"/>
+          <w:right w:space="0" w:sz="0" w:val="nil"/>
+          <w:between w:space="0" w:sz="0" w:val="nil"/>
+        </w:pBdr>
+        <w:shd w:fill="auto" w:val="clear"/>
+        <w:spacing w:after="0" w:before="0" w:line="360" w:lineRule="auto"/>
+        <w:ind w:left="1760" w:right="0" w:firstLine="0"/>
+        <w:jc w:val="left"/>
+        <w:rPr>
+          <w:rFonts w:ascii="Pretendard" w:cs="Pretendard" w:eastAsia="Pretendard" w:hAnsi="Pretendard"/>
+          <w:b w:val="0"/>
+          <w:bCs w:val="0"/>
+          <w:i w:val="0"/>
+          <w:iCs w:val="0"/>
+          <w:smallCaps w:val="0"/>
+          <w:strike w:val="0"/>
+          <w:color w:val="000000"/>
+          <w:sz w:val="22"/>
+          <w:szCs w:val="22"/>
+          <w:u w:val="none"/>
+          <w:shd w:fill="auto" w:val="clear"/>
+          <w:vertAlign w:val="baseline"/>
+        </w:rPr>
+      </w:pPr>
+      <w:r>
+        <w:rPr>
+          <w:rFonts w:ascii="Pretendard" w:cs="Pretendard" w:eastAsia="Pretendard" w:hAnsi="Pretendard"/>
+          <w:b w:val="0"/>
+          <w:bCs w:val="0"/>
+          <w:i w:val="0"/>
+          <w:iCs w:val="0"/>
+          <w:smallCaps w:val="0"/>
+          <w:strike w:val="0"/>
+          <w:color w:val="000000"/>
+          <w:sz w:val="22"/>
+          <w:szCs w:val="22"/>
+          <w:u w:val="none"/>
+          <w:shd w:fill="auto" w:val="clear"/>
+          <w:vertAlign w:val="baseline"/>
+          <w:rtl w:val="0"/>
+        </w:rPr>
+        <w:t xml:space="preserve">- 현장 질문 부족: 사회자 준비 질문(붙임 1)으로 즉시 대체</w:t>
+      </w:r>
     </w:p>
     <w:p>
       <w:pPr>
-        <w:ind w:left="1320" w:firstLine="0"/>
-        <w:rPr/>
-      </w:pPr>
-      <w:sdt>
-        <w:sdtPr>
-          <w:id w:val="1215502015"/>
-          <w:tag w:val="goog_rdk_9"/>
-        </w:sdtPr>
-        <w:sdtContent>
-          <w:r>
-            <w:rPr>
-              <w:rFonts w:ascii="Gungsuh" w:cs="Gungsuh" w:eastAsia="Gungsuh" w:hAnsi="Gungsuh"/>
-              <w:rtl w:val="0"/>
-            </w:rPr>
-            <w:t xml:space="preserve">- 음향 사고: 무선 마이크 배터리 및 예비 마이크 사전 점검</w:t>
-          </w:r>
-        </w:sdtContent>
-      </w:sdt>
+        <w:keepNext w:val="0"/>
+        <w:keepLines w:val="0"/>
+        <w:pageBreakBefore w:val="0"/>
+        <w:widowControl w:val="1"/>
+        <w:pBdr>
+          <w:top w:space="0" w:sz="0" w:val="nil"/>
+          <w:left w:space="0" w:sz="0" w:val="nil"/>
+          <w:bottom w:space="0" w:sz="0" w:val="nil"/>
+          <w:right w:space="0" w:sz="0" w:val="nil"/>
+          <w:between w:space="0" w:sz="0" w:val="nil"/>
+        </w:pBdr>
+        <w:shd w:fill="auto" w:val="clear"/>
+        <w:spacing w:after="0" w:before="0" w:line="360" w:lineRule="auto"/>
+        <w:ind w:left="1760" w:right="0" w:firstLine="0"/>
+        <w:jc w:val="left"/>
+        <w:rPr>
+          <w:rFonts w:ascii="Pretendard" w:cs="Pretendard" w:eastAsia="Pretendard" w:hAnsi="Pretendard"/>
+          <w:b w:val="0"/>
+          <w:bCs w:val="0"/>
+          <w:i w:val="0"/>
+          <w:iCs w:val="0"/>
+          <w:smallCaps w:val="0"/>
+          <w:strike w:val="0"/>
+          <w:color w:val="000000"/>
+          <w:sz w:val="22"/>
+          <w:szCs w:val="22"/>
+          <w:u w:val="none"/>
+          <w:shd w:fill="auto" w:val="clear"/>
+          <w:vertAlign w:val="baseline"/>
+        </w:rPr>
+      </w:pPr>
+      <w:r>
+        <w:rPr>
+          <w:rFonts w:ascii="Pretendard" w:cs="Pretendard" w:eastAsia="Pretendard" w:hAnsi="Pretendard"/>
+          <w:b w:val="0"/>
+          <w:bCs w:val="0"/>
+          <w:i w:val="0"/>
+          <w:iCs w:val="0"/>
+          <w:smallCaps w:val="0"/>
+          <w:strike w:val="0"/>
+          <w:color w:val="000000"/>
+          <w:sz w:val="22"/>
+          <w:szCs w:val="22"/>
+          <w:u w:val="none"/>
+          <w:shd w:fill="auto" w:val="clear"/>
+          <w:vertAlign w:val="baseline"/>
+          <w:rtl w:val="0"/>
+        </w:rPr>
+        <w:t xml:space="preserve">- 질문지 수거 지연: 수거 시작 시점을 강연 종료 5분 전으로 고정하고, 수거된 질문부터 순차적으로 사회자에게 전달</w:t>
+      </w:r>
     </w:p>
     <w:p>
       <w:pPr>
-        <w:ind w:left="1320" w:firstLine="0"/>
-        <w:rPr>
-          <w:rFonts w:ascii="Pretendard" w:cs="Pretendard" w:eastAsia="Pretendard" w:hAnsi="Pretendard"/>
-        </w:rPr>
-      </w:pPr>
-      <w:sdt>
-        <w:sdtPr>
-          <w:id w:val="278585171"/>
-          <w:tag w:val="goog_rdk_10"/>
-        </w:sdtPr>
-        <w:sdtContent>
-          <w:r>
-            <w:rPr>
-              <w:rFonts w:ascii="Gungsuh" w:cs="Gungsuh" w:eastAsia="Gungsuh" w:hAnsi="Gungsuh"/>
-              <w:rtl w:val="0"/>
-            </w:rPr>
-            <w:t xml:space="preserve">- 안전사고: 마이크맨 이동 동선의 통로 확보, 객석 혼잡 구간에 무대 인솔 스태프 배치</w:t>
-          </w:r>
-        </w:sdtContent>
-      </w:sdt>
+        <w:keepNext w:val="0"/>
+        <w:keepLines w:val="0"/>
+        <w:pageBreakBefore w:val="0"/>
+        <w:widowControl w:val="1"/>
+        <w:pBdr>
+          <w:top w:space="0" w:sz="0" w:val="nil"/>
+          <w:left w:space="0" w:sz="0" w:val="nil"/>
+          <w:bottom w:space="0" w:sz="0" w:val="nil"/>
+          <w:right w:space="0" w:sz="0" w:val="nil"/>
+          <w:between w:space="0" w:sz="0" w:val="nil"/>
+        </w:pBdr>
+        <w:shd w:fill="auto" w:val="clear"/>
+        <w:spacing w:after="0" w:before="0" w:line="360" w:lineRule="auto"/>
+        <w:ind w:left="1760" w:right="0" w:firstLine="0"/>
+        <w:jc w:val="left"/>
+        <w:rPr>
+          <w:rFonts w:ascii="Pretendard" w:cs="Pretendard" w:eastAsia="Pretendard" w:hAnsi="Pretendard"/>
+          <w:b w:val="0"/>
+          <w:bCs w:val="0"/>
+          <w:i w:val="0"/>
+          <w:iCs w:val="0"/>
+          <w:smallCaps w:val="0"/>
+          <w:strike w:val="0"/>
+          <w:color w:val="000000"/>
+          <w:sz w:val="22"/>
+          <w:szCs w:val="22"/>
+          <w:u w:val="none"/>
+          <w:shd w:fill="auto" w:val="clear"/>
+          <w:vertAlign w:val="baseline"/>
+        </w:rPr>
+      </w:pPr>
       <w:r>
         <w:rPr>
+          <w:rFonts w:ascii="Pretendard" w:cs="Pretendard" w:eastAsia="Pretendard" w:hAnsi="Pretendard"/>
+          <w:b w:val="0"/>
+          <w:bCs w:val="0"/>
+          <w:i w:val="0"/>
+          <w:iCs w:val="0"/>
+          <w:smallCaps w:val="0"/>
+          <w:strike w:val="0"/>
+          <w:color w:val="000000"/>
+          <w:sz w:val="22"/>
+          <w:szCs w:val="22"/>
+          <w:u w:val="none"/>
+          <w:shd w:fill="auto" w:val="clear"/>
+          <w:vertAlign w:val="baseline"/>
           <w:rtl w:val="0"/>
         </w:rPr>
+        <w:t xml:space="preserve">- 음향 사고: 무선 마이크 배터리 및 예비 마이크 사전 점검</w:t>
+      </w:r>
+    </w:p>
+    <w:p>
+      <w:pPr>
+        <w:keepNext w:val="0"/>
+        <w:keepLines w:val="0"/>
+        <w:pageBreakBefore w:val="0"/>
+        <w:widowControl w:val="1"/>
+        <w:pBdr>
+          <w:top w:space="0" w:sz="0" w:val="nil"/>
+          <w:left w:space="0" w:sz="0" w:val="nil"/>
+          <w:bottom w:space="0" w:sz="0" w:val="nil"/>
+          <w:right w:space="0" w:sz="0" w:val="nil"/>
+          <w:between w:space="0" w:sz="0" w:val="nil"/>
+        </w:pBdr>
+        <w:shd w:fill="auto" w:val="clear"/>
+        <w:spacing w:after="160" w:before="0" w:line="360" w:lineRule="auto"/>
+        <w:ind w:left="1760" w:right="0" w:firstLine="0"/>
+        <w:jc w:val="left"/>
+        <w:rPr>
+          <w:rFonts w:ascii="Pretendard" w:cs="Pretendard" w:eastAsia="Pretendard" w:hAnsi="Pretendard"/>
+          <w:b w:val="0"/>
+          <w:bCs w:val="0"/>
+          <w:i w:val="0"/>
+          <w:iCs w:val="0"/>
+          <w:smallCaps w:val="0"/>
+          <w:strike w:val="0"/>
+          <w:color w:val="000000"/>
+          <w:sz w:val="22"/>
+          <w:szCs w:val="22"/>
+          <w:u w:val="none"/>
+          <w:shd w:fill="auto" w:val="clear"/>
+          <w:vertAlign w:val="baseline"/>
+        </w:rPr>
+      </w:pPr>
+      <w:r>
+        <w:rPr>
+          <w:rFonts w:ascii="Pretendard" w:cs="Pretendard" w:eastAsia="Pretendard" w:hAnsi="Pretendard"/>
+          <w:b w:val="0"/>
+          <w:bCs w:val="0"/>
+          <w:i w:val="0"/>
+          <w:iCs w:val="0"/>
+          <w:smallCaps w:val="0"/>
+          <w:strike w:val="0"/>
+          <w:color w:val="000000"/>
+          <w:sz w:val="22"/>
+          <w:szCs w:val="22"/>
+          <w:u w:val="none"/>
+          <w:shd w:fill="auto" w:val="clear"/>
+          <w:vertAlign w:val="baseline"/>
+          <w:rtl w:val="0"/>
+        </w:rPr>
+        <w:t xml:space="preserve">- 안전사고: 질문지 배부·수거 스태프의 이동 통로 확보, 객석 혼잡 구간에 무대 인솔 스태프 배치</w:t>
       </w:r>
     </w:p>
     <w:p>
@@ -8281,7 +8038,60 @@
           <w:vertAlign w:val="baseline"/>
           <w:rtl w:val="0"/>
         </w:rPr>
-        <w:t xml:space="preserve">- 칠판 (Q&amp;A 질문 부착용)</w:t>
+        <w:t xml:space="preserve">- 칠판 (현장 질문지 부착용)</w:t>
+      </w:r>
+    </w:p>
+    <w:p>
+      <w:pPr>
+        <w:keepNext w:val="0"/>
+        <w:keepLines w:val="0"/>
+        <w:pageBreakBefore w:val="0"/>
+        <w:widowControl w:val="1"/>
+        <w:pBdr>
+          <w:top w:space="0" w:sz="0" w:val="nil"/>
+          <w:left w:space="0" w:sz="0" w:val="nil"/>
+          <w:bottom w:space="0" w:sz="0" w:val="nil"/>
+          <w:right w:space="0" w:sz="0" w:val="nil"/>
+          <w:between w:space="0" w:sz="0" w:val="nil"/>
+        </w:pBdr>
+        <w:shd w:fill="auto" w:val="clear"/>
+        <w:spacing w:after="0" w:before="0" w:line="360" w:lineRule="auto"/>
+        <w:ind w:left="1760" w:right="0" w:firstLine="0"/>
+        <w:jc w:val="left"/>
+        <w:rPr>
+          <w:rFonts w:ascii="Pretendard" w:cs="Pretendard" w:eastAsia="Pretendard" w:hAnsi="Pretendard"/>
+          <w:b w:val="0"/>
+          <w:bCs w:val="0"/>
+          <w:i w:val="0"/>
+          <w:iCs w:val="0"/>
+          <w:smallCaps w:val="0"/>
+          <w:strike w:val="0"/>
+          <w:color w:val="808080"/>
+          <w:sz w:val="22"/>
+          <w:szCs w:val="22"/>
+          <w:u w:val="none"/>
+          <w:shd w:fill="auto" w:val="clear"/>
+          <w:vertAlign w:val="baseline"/>
+        </w:rPr>
+      </w:pPr>
+      <w:r>
+        <w:rPr>
+          <w:rFonts w:ascii="Pretendard" w:cs="Pretendard" w:eastAsia="Pretendard" w:hAnsi="Pretendard"/>
+          <w:b w:val="0"/>
+          <w:bCs w:val="0"/>
+          <w:i w:val="0"/>
+          <w:iCs w:val="0"/>
+          <w:smallCaps w:val="0"/>
+          <w:strike w:val="0"/>
+          <w:color w:val="808080"/>
+          <w:sz w:val="22"/>
+          <w:szCs w:val="22"/>
+          <w:u w:val="none"/>
+          <w:shd w:fill="auto" w:val="clear"/>
+          <w:vertAlign w:val="baseline"/>
+          <w:rtl w:val="0"/>
+        </w:rPr>
+        <w:t xml:space="preserve">- 포스트잇, 필기구 (현장 질문 작성용)</w:t>
       </w:r>
     </w:p>
     <w:p>
@@ -10298,7 +10108,7 @@
           <w:vertAlign w:val="baseline"/>
           <w:rtl w:val="0"/>
         </w:rPr>
-        <w:t xml:space="preserve">[붙임 1] 질의응답 예상 질문 (사전 질문 선정 및 사회자 큐카드 참고용)</w:t>
+        <w:t xml:space="preserve">[붙임 1] 질의응답 사회자 준비 질문 (현장 질문 부족 시 활용)</w:t>
       </w:r>
     </w:p>
     <w:p>
@@ -11097,7 +10907,7 @@
           <w:vertAlign w:val="baseline"/>
           <w:rtl w:val="0"/>
         </w:rPr>
-        <w:t xml:space="preserve">※ 실제 질문은 사전 질문 중 선별하여 강사에게 미리 전달하며, 민감한 질문은 강사와 협의하여 조율한다.</w:t>
+        <w:t xml:space="preserve">※ 질의응답은 현장 질문지를 우선으로 진행하며, 질문이 부족할 경우 위 질문 중 선별하여 사회자가 진행한다. 질문 목록은 사전에 강사와 공유하여 조율한다.</w:t>
       </w:r>
     </w:p>
     <w:p>

</xml_diff>